<commit_message>
Record the protocol parser now that malformed lines are rejected in tests.
</commit_message>
<xml_diff>
--- a/docs/hardware-handoff.docx
+++ b/docs/hardware-handoff.docx
@@ -68,8 +68,21 @@
       </w:r>
     </w:p>
     <w:p>
+      <w:pPr>
+        <w:pStyle w:val="Heading2"/>
+      </w:pPr>
       <w:r>
-        <w:t xml:space="preserve">还没做：报文解析程序、模拟器、识别、数据库、真机联调。</w:t>
+        <w:t xml:space="preserve">1.1 协议检查</w:t>
+      </w:r>
+    </w:p>
+    <w:p>
+      <w:r>
+        <w:t xml:space="preserve">电脑已经能检查一行 JSON 是否符合协议。合法行变成消息，坏行会被拒绝。这一步有 13 个自动测试。</w:t>
+      </w:r>
+    </w:p>
+    <w:p>
+      <w:r>
+        <w:t xml:space="preserve">还没做：内部数据模型之后的模拟器、识别、数据库、真机联调。</w:t>
       </w:r>
     </w:p>
     <w:sectPr>

</xml_diff>

<commit_message>
Separate internal scale objects from the wire protocol so later modules share one shape.
</commit_message>
<xml_diff>
--- a/docs/hardware-handoff.docx
+++ b/docs/hardware-handoff.docx
@@ -81,8 +81,21 @@
       </w:r>
     </w:p>
     <w:p>
+      <w:pPr>
+        <w:pStyle w:val="Heading2"/>
+      </w:pPr>
       <w:r>
-        <w:t xml:space="preserve">还没做：内部数据模型之后的模拟器、识别、数据库、真机联调。</w:t>
+        <w:t xml:space="preserve">1.2 内部数据</w:t>
+      </w:r>
+    </w:p>
+    <w:p>
+      <w:r>
+        <w:t xml:space="preserve">程序内部传递的重量、状态和去皮命令已经有固定形状，和串口上的 JSON 分开。视觉和融合只留了空的数据表，还没有模型。</w:t>
+      </w:r>
+    </w:p>
+    <w:p>
+      <w:r>
+        <w:t xml:space="preserve">还没做：模拟秤、识别、数据库、真机联调。</w:t>
       </w:r>
     </w:p>
     <w:sectPr>

</xml_diff>

<commit_message>
Add a scripted scale so the host can run weight scenarios before any board is attached.
</commit_message>
<xml_diff>
--- a/docs/hardware-handoff.docx
+++ b/docs/hardware-handoff.docx
@@ -94,8 +94,21 @@
       </w:r>
     </w:p>
     <w:p>
+      <w:pPr>
+        <w:pStyle w:val="Heading2"/>
+      </w:pPr>
       <w:r>
-        <w:t xml:space="preserve">还没做：模拟秤、识别、数据库、真机联调。</w:t>
+        <w:t xml:space="preserve">1.3 模拟秤</w:t>
+      </w:r>
+    </w:p>
+    <w:p>
+      <w:r>
+        <w:t xml:space="preserve">没有板子时，电脑可以用同一套设备接口演放上、放稳、拿走、过载和断开。上电不会自动去皮。</w:t>
+      </w:r>
+    </w:p>
+    <w:p>
+      <w:r>
+        <w:t xml:space="preserve">还没做：主机启动入口、识别、数据库、真机联调。</w:t>
       </w:r>
     </w:p>
     <w:sectPr>

</xml_diff>

<commit_message>
Start the host from configuration and record the current file map in the progress notes.
</commit_message>
<xml_diff>
--- a/docs/hardware-handoff.docx
+++ b/docs/hardware-handoff.docx
@@ -107,8 +107,49 @@
       </w:r>
     </w:p>
     <w:p>
+      <w:pPr>
+        <w:pStyle w:val="Heading2"/>
+      </w:pPr>
       <w:r>
-        <w:t xml:space="preserve">还没做：主机启动入口、识别、数据库、真机联调。</w:t>
+        <w:t xml:space="preserve">1.4 主机入口</w:t>
+      </w:r>
+    </w:p>
+    <w:p>
+      <w:r>
+        <w:t xml:space="preserve">python -m scale_host 可以启动。默认设备是模拟器，视觉关闭。这一步只打印这三行，还不显示重量。</w:t>
+      </w:r>
+    </w:p>
+    <w:p>
+      <w:pPr>
+        <w:pStyle w:val="Heading2"/>
+      </w:pPr>
+      <w:r>
+        <w:t xml:space="preserve">目前有哪些文件</w:t>
+      </w:r>
+    </w:p>
+    <w:p>
+      <w:r>
+        <w:t xml:space="preserve">docs/protocol.md：一行一个 JSON 的通信约定。docs/state-machine.md：八个状态。docs/hardware-handoff.docx：本进度说明。</w:t>
+      </w:r>
+    </w:p>
+    <w:p>
+      <w:r>
+        <w:t xml:space="preserve">firmware/ 仍是空目录，只标明以后放驱动、称重、协议编码和状态机。芯片还没定，不要把课程点灯工程拷进来。</w:t>
+      </w:r>
+    </w:p>
+    <w:p>
+      <w:r>
+        <w:t xml:space="preserve">host/scale_host/main.py：启动入口。protocol/messages.py：检查报文。domain/models.py：程序内部的重量和状态。device/simulator.py：假秤。vision、fusion、storage、agent、ui 都还是空位。</w:t>
+      </w:r>
+    </w:p>
+    <w:p>
+      <w:r>
+        <w:t xml:space="preserve">tests/unit/ 里有协议、内部数据、假秤和启动打印的测试。data/ 和 simulator/scenarios/ 仍是空位。scripts/setup.ps1 用来安装 Python 环境。</w:t>
+      </w:r>
+    </w:p>
+    <w:p>
+      <w:r>
+        <w:t xml:space="preserve">还没做：单独的场景命令、识别、数据库、真机联调。</w:t>
       </w:r>
     </w:p>
     <w:sectPr>

</xml_diff>

<commit_message>
Add a scenario command so a banana weighing can be replayed without a board.
</commit_message>
<xml_diff>
--- a/docs/hardware-handoff.docx
+++ b/docs/hardware-handoff.docx
@@ -124,6 +124,19 @@
         <w:pStyle w:val="Heading2"/>
       </w:pPr>
       <w:r>
+        <w:t xml:space="preserve">1.5 场景命令</w:t>
+      </w:r>
+    </w:p>
+    <w:p>
+      <w:r>
+        <w:t xml:space="preserve">python -m simulator --scenario banana 会在没有板子的电脑上打出 0 克到 326.4 克，最后一行带 STABLE。scripts 里增加了播放场景、启动主机和跑测试三个脚本。</w:t>
+      </w:r>
+    </w:p>
+    <w:p>
+      <w:pPr>
+        <w:pStyle w:val="Heading2"/>
+      </w:pPr>
+      <w:r>
         <w:t xml:space="preserve">目前有哪些文件</w:t>
       </w:r>
     </w:p>
@@ -139,17 +152,22 @@
     </w:p>
     <w:p>
       <w:r>
-        <w:t xml:space="preserve">host/scale_host/main.py：启动入口。protocol/messages.py：检查报文。domain/models.py：程序内部的重量和状态。device/simulator.py：假秤。vision、fusion、storage、agent、ui 都还是空位。</w:t>
-      </w:r>
-    </w:p>
-    <w:p>
-      <w:r>
-        <w:t xml:space="preserve">tests/unit/ 里有协议、内部数据、假秤和启动打印的测试。data/ 和 simulator/scenarios/ 仍是空位。scripts/setup.ps1 用来安装 Python 环境。</w:t>
-      </w:r>
-    </w:p>
-    <w:p>
-      <w:r>
-        <w:t xml:space="preserve">还没做：单独的场景命令、识别、数据库、真机联调。</w:t>
+        <w:t xml:space="preserve">host/scale_host/main.py：启动入口，目前只打印开关。protocol/messages.py：检查报文。domain/models.py：程序内部的重量和状态。device/simulator.py：假秤规则。vision、fusion、storage、agent、ui 都还是空位。</w:t>
+      </w:r>
+    </w:p>
+    <w:p>
+      <w:r>
+        <w:t xml:space="preserve">simulator/__main__.py：把假秤场景打到屏幕上。scripts/setup.ps1 安装环境，run_host.ps1 启动主机，run_simulator.ps1 播放场景，test.ps1 跑测试。</w:t>
+      </w:r>
+    </w:p>
+    <w:p>
+      <w:r>
+        <w:t xml:space="preserve">tests/unit/ 里有协议、内部数据、假秤、启动打印和香蕉场景命令的测试。data/ 仍是空位。</w:t>
+      </w:r>
+    </w:p>
+    <w:p>
+      <w:r>
+        <w:t xml:space="preserve">还没做：识别、数据库、真机联调。</w:t>
       </w:r>
     </w:p>
     <w:sectPr>

</xml_diff>

<commit_message>
Make the daily test run green without a board and keep hardware checks opt-in.
</commit_message>
<xml_diff>
--- a/docs/hardware-handoff.docx
+++ b/docs/hardware-handoff.docx
@@ -137,6 +137,19 @@
         <w:pStyle w:val="Heading2"/>
       </w:pPr>
       <w:r>
+        <w:t xml:space="preserve">1.6 日常测试</w:t>
+      </w:r>
+    </w:p>
+    <w:p>
+      <w:r>
+        <w:t xml:space="preserve">scripts/test.ps1 在不插板子时跑完全部日常测试。连续半秒内波动不超过 0.5 克才算稳定。真板测试单独放着，默认不跑。这台电脑不能直接双击 ps1，需要用 ExecutionPolicy Bypass 调用。</w:t>
+      </w:r>
+    </w:p>
+    <w:p>
+      <w:pPr>
+        <w:pStyle w:val="Heading2"/>
+      </w:pPr>
+      <w:r>
         <w:t xml:space="preserve">目前有哪些文件</w:t>
       </w:r>
     </w:p>
@@ -152,17 +165,17 @@
     </w:p>
     <w:p>
       <w:r>
-        <w:t xml:space="preserve">host/scale_host/main.py：启动入口，目前只打印开关。protocol/messages.py：检查报文。domain/models.py：程序内部的重量和状态。device/simulator.py：假秤规则。vision、fusion、storage、agent、ui 都还是空位。</w:t>
-      </w:r>
-    </w:p>
-    <w:p>
-      <w:r>
-        <w:t xml:space="preserve">simulator/__main__.py：把假秤场景打到屏幕上。scripts/setup.ps1 安装环境，run_host.ps1 启动主机，run_simulator.ps1 播放场景，test.ps1 跑测试。</w:t>
-      </w:r>
-    </w:p>
-    <w:p>
-      <w:r>
-        <w:t xml:space="preserve">tests/unit/ 里有协议、内部数据、假秤、启动打印和香蕉场景命令的测试。data/ 仍是空位。</w:t>
+        <w:t xml:space="preserve">host/scale_host/main.py：启动入口，目前只打印开关。protocol/messages.py：检查报文。domain/models.py：程序内部的重量和状态。device/dynamics.py：稳定判定。device/simulator.py：假秤规则。vision、fusion、storage、agent、ui 都还是空位。</w:t>
+      </w:r>
+    </w:p>
+    <w:p>
+      <w:r>
+        <w:t xml:space="preserve">simulator/__main__.py：把假秤场景打到屏幕上。scripts/setup.ps1 安装环境，run_host.ps1 启动主机，run_simulator.ps1 播放场景，test.ps1 跑日常测试。</w:t>
+      </w:r>
+    </w:p>
+    <w:p>
+      <w:r>
+        <w:t xml:space="preserve">tests/unit/test_dynamics.py：稳定判定。tests/unit/ 还有协议、内部数据、假秤、启动打印和香蕉场景命令的测试。tests/hardware/test_board_optional.py：真板占位，日常会跳过。data/ 仍是空位。</w:t>
       </w:r>
     </w:p>
     <w:p>

</xml_diff>

<commit_message>
Store weighing history locally and leave prices to a separate text model.
SQLite keeps sessions and corrections. Vision only identifies an item, and MiniMax, Volcano Engine, and the text lookup stay as empty API-key slots that do not call the network.

Co-authored-by: Cursor <cursoragent@cursor.com>
</commit_message>
<xml_diff>
--- a/docs/hardware-handoff.docx
+++ b/docs/hardware-handoff.docx
@@ -150,12 +150,43 @@
         <w:pStyle w:val="Heading2"/>
       </w:pPr>
       <w:r>
+        <w:t xml:space="preserve">2.1 称重记录</w:t>
+      </w:r>
+    </w:p>
+    <w:p>
+      <w:r>
+        <w:t xml:space="preserve">一次称重可以写入 SQLite，再读出来。用户说认错了，会记下原来的预测、正确名字，以及当时的重量和图片路径。这张库只记历史，不存全部商品单价。</w:t>
+      </w:r>
+    </w:p>
+    <w:p>
+      <w:pPr>
+        <w:pStyle w:val="Heading2"/>
+      </w:pPr>
+      <w:r>
+        <w:t xml:space="preserve">2.2 识别和查价分成两个模型</w:t>
+      </w:r>
+    </w:p>
+    <w:p>
+      <w:r>
+        <w:t xml:space="preserve">不再准备一份本地商品总价表。电脑先用多模态模型看照片，只回答这是什么。然后再用一个更小的纯文本模型查单价和简介。多模态可以以后选 MiniMax 或火山引擎。两个模型的 key 现在都是空位，还不会真的上网查询。</w:t>
+      </w:r>
+    </w:p>
+    <w:p>
+      <w:r>
+        <w:t xml:space="preserve">对固件没有影响。单片机仍然只上报重量和状态，不负责认物品，也不负责价格。</w:t>
+      </w:r>
+    </w:p>
+    <w:p>
+      <w:pPr>
+        <w:pStyle w:val="Heading2"/>
+      </w:pPr>
+      <w:r>
         <w:t xml:space="preserve">目前有哪些文件</w:t>
       </w:r>
     </w:p>
     <w:p>
       <w:r>
-        <w:t xml:space="preserve">docs/protocol.md：一行一个 JSON 的通信约定。docs/state-machine.md：八个状态。docs/hardware-handoff.docx：本进度说明。</w:t>
+        <w:t xml:space="preserve">docs/protocol.md：一行一个 JSON 的通信约定。docs/state-machine.md：八个状态。docs/todo.md：调整后的开发顺序。docs/hardware-handoff.docx：本进度说明。</w:t>
       </w:r>
     </w:p>
     <w:p>
@@ -165,7 +196,12 @@
     </w:p>
     <w:p>
       <w:r>
-        <w:t xml:space="preserve">host/scale_host/main.py：启动入口，目前只打印开关。protocol/messages.py：检查报文。domain/models.py：程序内部的重量和状态。device/dynamics.py：稳定判定。device/simulator.py：假秤规则。vision、fusion、storage、agent、ui 都还是空位。</w:t>
+        <w:t xml:space="preserve">host/scale_host/main.py：启动入口，打印设备、视觉和查价三个开关。protocol/messages.py：检查报文。domain/models.py：程序内部的重量和状态。device/dynamics.py：稳定判定。device/simulator.py：假秤规则。storage/sqlite.py：把称重和纠错存进本地数据库。vision/interface.py：认物品的空位。catalog/lookup.py：查单价的空位。fusion、agent、ui 还是空位。</w:t>
+      </w:r>
+    </w:p>
+    <w:p>
+      <w:r>
+        <w:t xml:space="preserve">.env.example：MiniMax、火山引擎和文本模型的 key 都留空。真 key 以后只放在本机 .env，不进仓库。</w:t>
       </w:r>
     </w:p>
     <w:p>
@@ -175,12 +211,12 @@
     </w:p>
     <w:p>
       <w:r>
-        <w:t xml:space="preserve">tests/unit/test_dynamics.py：稳定判定。tests/unit/ 还有协议、内部数据、假秤、启动打印和香蕉场景命令的测试。tests/hardware/test_board_optional.py：真板占位，日常会跳过。data/ 仍是空位。</w:t>
-      </w:r>
-    </w:p>
-    <w:p>
-      <w:r>
-        <w:t xml:space="preserve">还没做：识别、数据库、真机联调。</w:t>
+        <w:t xml:space="preserve">tests/unit/test_providers.py：没 key 时不会联网。tests/unit/test_sqlite_repository.py：数据库读写。另外还有协议、内部数据、假秤、稳定判定、启动打印和香蕉场景命令的测试。tests/hardware/test_board_optional.py：真板占位，日常会跳过。</w:t>
+      </w:r>
+    </w:p>
+    <w:p>
+      <w:r>
+        <w:t xml:space="preserve">还没做：真的调用云模型、融合金额、真机联调。</w:t>
       </w:r>
     </w:p>
     <w:sectPr>

</xml_diff>

<commit_message>
Show a unit price for a recognized item without calling a cloud model.
The mock path names banana.jpg and prints 12 yuan per kilogram. Weight is not applied yet, and no API key is sent anywhere.

Co-authored-by: Cursor <cursoragent@cursor.com>
</commit_message>
<xml_diff>
--- a/docs/hardware-handoff.docx
+++ b/docs/hardware-handoff.docx
@@ -181,6 +181,24 @@
         <w:pStyle w:val="Heading2"/>
       </w:pPr>
       <w:r>
+        <w:t xml:space="preserve">2.3 模拟识别后查单价</w:t>
+      </w:r>
+    </w:p>
+    <w:p>
+      <w:r>
+        <w:t xml:space="preserve">没有摄像头、也没有云模型 key 时，可以先走通一条固定结果：占位图 banana.jpg 被认成香蕉，再查出每千克 12 元。这是测试单价，不是市场价，也不乘重量。金额留到下一步融合。</w:t>
+      </w:r>
+    </w:p>
+    <w:p>
+      <w:r>
+        <w:t xml:space="preserve">命令是 scripts/run_quote.ps1。屏幕上应出现 label: banana 和 price_per_kg: 12.0。</w:t>
+      </w:r>
+    </w:p>
+    <w:p>
+      <w:pPr>
+        <w:pStyle w:val="Heading2"/>
+      </w:pPr>
+      <w:r>
         <w:t xml:space="preserve">目前有哪些文件</w:t>
       </w:r>
     </w:p>
@@ -196,7 +214,7 @@
     </w:p>
     <w:p>
       <w:r>
-        <w:t xml:space="preserve">host/scale_host/main.py：启动入口，打印设备、视觉和查价三个开关。protocol/messages.py：检查报文。domain/models.py：程序内部的重量和状态。device/dynamics.py：稳定判定。device/simulator.py：假秤规则。storage/sqlite.py：把称重和纠错存进本地数据库。vision/interface.py：认物品的空位。catalog/lookup.py：查单价的空位。fusion、agent、ui 还是空位。</w:t>
+        <w:t xml:space="preserve">host/scale_host/main.py：启动入口，打印设备、视觉和查价三个开关。quote.py：先认物品再查单价。protocol/messages.py：检查报文。domain/models.py：程序内部的重量和状态。device/dynamics.py：稳定判定。device/simulator.py：假秤规则。storage/sqlite.py：把称重和纠错存进本地数据库。vision/interface.py：认物品的空位。catalog/lookup.py：查单价的空位。fusion、agent、ui 还是空位。</w:t>
       </w:r>
     </w:p>
     <w:p>
@@ -206,7 +224,7 @@
     </w:p>
     <w:p>
       <w:r>
-        <w:t xml:space="preserve">simulator/__main__.py：把假秤场景打到屏幕上。scripts/setup.ps1 安装环境，run_host.ps1 启动主机，run_simulator.ps1 播放场景，test.ps1 跑日常测试。</w:t>
+        <w:t xml:space="preserve">simulator/__main__.py：把假秤场景打到屏幕上。scripts/setup.ps1 安装环境，run_host.ps1 启动主机，run_simulator.ps1 播放称重场景，run_quote.ps1 打印香蕉单价，test.ps1 跑日常测试。</w:t>
       </w:r>
     </w:p>
     <w:p>
@@ -216,7 +234,7 @@
     </w:p>
     <w:p>
       <w:r>
-        <w:t xml:space="preserve">还没做：真的调用云模型、融合金额、真机联调。</w:t>
+        <w:t xml:space="preserve">还没做：用重量乘单价得到金额、真的调用云模型、真机联调。</w:t>
       </w:r>
     </w:p>
     <w:sectPr>

</xml_diff>

<commit_message>
Price a stable weight from the recognized unit price.
A simulated banana at 326.4 g and 12 yuan per kilogram becomes 3.92 yuan. Unstable, empty, and overload readings are refused.

Co-authored-by: Cursor <cursoragent@cursor.com>
</commit_message>
<xml_diff>
--- a/docs/hardware-handoff.docx
+++ b/docs/hardware-handoff.docx
@@ -199,6 +199,24 @@
         <w:pStyle w:val="Heading2"/>
       </w:pPr>
       <w:r>
+        <w:t xml:space="preserve">2.4 用稳定重量算金额</w:t>
+      </w:r>
+    </w:p>
+    <w:p>
+      <w:r>
+        <w:t xml:space="preserve">假秤上的香蕉稳定在 326.4 克。电脑用上一步的测试单价每千克 12 元，算出 3.92 元。重量还在变、秤过载，或者秤上是空的，都不出金额。这一步仍不联网，也不把结果写进数据库。</w:t>
+      </w:r>
+    </w:p>
+    <w:p>
+      <w:r>
+        <w:t xml:space="preserve">命令是 scripts/run_sale.ps1。屏幕上应出现 weight_g: 326.4 和 amount_yuan: 3.92。单片机仍然只负责把克数报上来，金额在电脑上算。</w:t>
+      </w:r>
+    </w:p>
+    <w:p>
+      <w:pPr>
+        <w:pStyle w:val="Heading2"/>
+      </w:pPr>
+      <w:r>
         <w:t xml:space="preserve">目前有哪些文件</w:t>
       </w:r>
     </w:p>
@@ -214,7 +232,7 @@
     </w:p>
     <w:p>
       <w:r>
-        <w:t xml:space="preserve">host/scale_host/main.py：启动入口，打印设备、视觉和查价三个开关。quote.py：先认物品再查单价。protocol/messages.py：检查报文。domain/models.py：程序内部的重量和状态。device/dynamics.py：稳定判定。device/simulator.py：假秤规则。storage/sqlite.py：把称重和纠错存进本地数据库。vision/interface.py：认物品的空位。catalog/lookup.py：查单价的空位。fusion、agent、ui 还是空位。</w:t>
+        <w:t xml:space="preserve">host/scale_host/main.py：启动入口，打印设备、视觉和查价三个开关。quote.py：先认物品再查单价。sale.py：等重量稳定后算出金额。fusion/price.py：克数乘单价，四舍五入到分。protocol/messages.py：检查报文。domain/models.py：程序内部的重量和状态。device/dynamics.py：稳定判定。device/simulator.py：假秤规则。storage/sqlite.py：把称重和纠错存进本地数据库。vision/interface.py：认物品的空位。catalog/lookup.py：查单价的空位。agent、ui 还是空位。</w:t>
       </w:r>
     </w:p>
     <w:p>
@@ -224,7 +242,7 @@
     </w:p>
     <w:p>
       <w:r>
-        <w:t xml:space="preserve">simulator/__main__.py：把假秤场景打到屏幕上。scripts/setup.ps1 安装环境，run_host.ps1 启动主机，run_simulator.ps1 播放称重场景，run_quote.ps1 打印香蕉单价，test.ps1 跑日常测试。</w:t>
+        <w:t xml:space="preserve">simulator/__main__.py：把假秤场景打到屏幕上。scripts/setup.ps1 安装环境，run_host.ps1 启动主机，run_simulator.ps1 播放称重场景，run_quote.ps1 打印香蕉单价，run_sale.ps1 打印 3.92 元，test.ps1 跑日常测试。</w:t>
       </w:r>
     </w:p>
     <w:p>
@@ -234,7 +252,7 @@
     </w:p>
     <w:p>
       <w:r>
-        <w:t xml:space="preserve">还没做：用重量乘单价得到金额、真的调用云模型、真机联调。</w:t>
+        <w:t xml:space="preserve">还没做：把这次金额写进数据库、真的调用云模型、真机联调。</w:t>
       </w:r>
     </w:p>
     <w:sectPr>

</xml_diff>

<commit_message>
Save the priced banana weighing so it can be read back.
The simulator, mock recognition, mock unit price, and fusion write one SQLite row with 326.4 g and 3.92 yuan.

Co-authored-by: Cursor <cursoragent@cursor.com>
</commit_message>
<xml_diff>
--- a/docs/hardware-handoff.docx
+++ b/docs/hardware-handoff.docx
@@ -217,6 +217,24 @@
         <w:pStyle w:val="Heading2"/>
       </w:pPr>
       <w:r>
+        <w:t xml:space="preserve">2.5 把这次结果记下来</w:t>
+      </w:r>
+    </w:p>
+    <w:p>
+      <w:r>
+        <w:t xml:space="preserve">假秤、认成香蕉、查出每千克 12 元、算出 3.92 元，这四步接在一起之后，会写入 SQLite，再从数据库读出来。读回的仍是 326.4 克和 3.92 元。数据库记的是这一次称重，不是一份商品总价表。</w:t>
+      </w:r>
+    </w:p>
+    <w:p>
+      <w:r>
+        <w:t xml:space="preserve">命令是 scripts/run_record.ps1。屏幕上除了金额，还应出现 stored: banana-demo。这表示这一行是从数据库读回来的。</w:t>
+      </w:r>
+    </w:p>
+    <w:p>
+      <w:pPr>
+        <w:pStyle w:val="Heading2"/>
+      </w:pPr>
+      <w:r>
         <w:t xml:space="preserve">目前有哪些文件</w:t>
       </w:r>
     </w:p>
@@ -232,7 +250,7 @@
     </w:p>
     <w:p>
       <w:r>
-        <w:t xml:space="preserve">host/scale_host/main.py：启动入口，打印设备、视觉和查价三个开关。quote.py：先认物品再查单价。sale.py：等重量稳定后算出金额。fusion/price.py：克数乘单价，四舍五入到分。protocol/messages.py：检查报文。domain/models.py：程序内部的重量和状态。device/dynamics.py：稳定判定。device/simulator.py：假秤规则。storage/sqlite.py：把称重和纠错存进本地数据库。vision/interface.py：认物品的空位。catalog/lookup.py：查单价的空位。agent、ui 还是空位。</w:t>
+        <w:t xml:space="preserve">host/scale_host/main.py：启动入口，打印设备、视觉和查价三个开关。quote.py：先认物品再查单价。sale.py：等重量稳定后算出金额。pipeline.py：把这次金额写入数据库再读出。fusion/price.py：克数乘单价，四舍五入到分。protocol/messages.py：检查报文。domain/models.py：程序内部的重量和状态。device/dynamics.py：稳定判定。device/simulator.py：假秤规则。storage/sqlite.py：本地数据库，现在也能记下名称、单价和金额。vision/interface.py：认物品的空位。catalog/lookup.py：查单价的空位。agent、ui 还是空位。</w:t>
       </w:r>
     </w:p>
     <w:p>
@@ -242,17 +260,17 @@
     </w:p>
     <w:p>
       <w:r>
-        <w:t xml:space="preserve">simulator/__main__.py：把假秤场景打到屏幕上。scripts/setup.ps1 安装环境，run_host.ps1 启动主机，run_simulator.ps1 播放称重场景，run_quote.ps1 打印香蕉单价，run_sale.ps1 打印 3.92 元，test.ps1 跑日常测试。</w:t>
-      </w:r>
-    </w:p>
-    <w:p>
-      <w:r>
-        <w:t xml:space="preserve">tests/unit/test_providers.py：没 key 时不会联网。tests/unit/test_sqlite_repository.py：数据库读写。另外还有协议、内部数据、假秤、稳定判定、启动打印和香蕉场景命令的测试。tests/hardware/test_board_optional.py：真板占位，日常会跳过。</w:t>
-      </w:r>
-    </w:p>
-    <w:p>
-      <w:r>
-        <w:t xml:space="preserve">还没做：把这次金额写进数据库、真的调用云模型、真机联调。</w:t>
+        <w:t xml:space="preserve">simulator/__main__.py：把假秤场景打到屏幕上。scripts/setup.ps1 安装环境，run_host.ps1 启动主机，run_simulator.ps1 播放称重场景，run_quote.ps1 打印香蕉单价，run_sale.ps1 打印 3.92 元，run_record.ps1 把这次结果写入数据库再读出，test.ps1 跑日常测试。</w:t>
+      </w:r>
+    </w:p>
+    <w:p>
+      <w:r>
+        <w:t xml:space="preserve">tests/integration/test_banana_pipeline.py：从假秤走到数据库。tests/unit/test_providers.py：没 key 时不会联网。tests/unit/test_sqlite_repository.py：数据库读写。另外还有协议、内部数据、假秤、稳定判定、启动打印和香蕉场景命令的测试。tests/hardware/test_board_optional.py：真板占位，日常会跳过。</w:t>
+      </w:r>
+    </w:p>
+    <w:p>
+      <w:r>
+        <w:t xml:space="preserve">还没做：启动时直接打印这次结果、真的调用云模型、真机联调。</w:t>
       </w:r>
     </w:p>
     <w:sectPr>

</xml_diff>

<commit_message>
Print the simulated banana sale when the host starts.
With mock recognition there is still no camera. The startup line shows 3.92 yuan and the id of the stored weighing.

Co-authored-by: Cursor <cursoragent@cursor.com>
</commit_message>
<xml_diff>
--- a/docs/hardware-handoff.docx
+++ b/docs/hardware-handoff.docx
@@ -235,6 +235,24 @@
         <w:pStyle w:val="Heading2"/>
       </w:pPr>
       <w:r>
+        <w:t xml:space="preserve">2.6 启动主机就看到结果</w:t>
+      </w:r>
+    </w:p>
+    <w:p>
+      <w:r>
+        <w:t xml:space="preserve">现在直接启动主机，就会用假秤走一遍香蕉：326.4 克，每千克 12 元，金额 3.92 元，并写入数据库。屏幕上有一行 stored: banana- 开头的编号，每次启动编号不同。不需要摄像头，也不联网。</w:t>
+      </w:r>
+    </w:p>
+    <w:p>
+      <w:r>
+        <w:t xml:space="preserve">命令是 scripts/run_host.ps1。如果把视觉开关设成 disabled，主机只打印三个开关，不算钱。单片机仍然只报重量。</w:t>
+      </w:r>
+    </w:p>
+    <w:p>
+      <w:pPr>
+        <w:pStyle w:val="Heading2"/>
+      </w:pPr>
+      <w:r>
         <w:t xml:space="preserve">目前有哪些文件</w:t>
       </w:r>
     </w:p>
@@ -250,12 +268,12 @@
     </w:p>
     <w:p>
       <w:r>
-        <w:t xml:space="preserve">host/scale_host/main.py：启动入口，打印设备、视觉和查价三个开关。quote.py：先认物品再查单价。sale.py：等重量稳定后算出金额。pipeline.py：把这次金额写入数据库再读出。fusion/price.py：克数乘单价，四舍五入到分。protocol/messages.py：检查报文。domain/models.py：程序内部的重量和状态。device/dynamics.py：稳定判定。device/simulator.py：假秤规则。storage/sqlite.py：本地数据库，现在也能记下名称、单价和金额。vision/interface.py：认物品的空位。catalog/lookup.py：查单价的空位。agent、ui 还是空位。</w:t>
-      </w:r>
-    </w:p>
-    <w:p>
-      <w:r>
-        <w:t xml:space="preserve">.env.example：MiniMax、火山引擎和文本模型的 key 都留空。真 key 以后只放在本机 .env，不进仓库。</w:t>
+        <w:t xml:space="preserve">host/scale_host/main.py：启动入口。默认识别打开时，会打印金额和数据库编号。quote.py：先认物品再查单价。sale.py：等重量稳定后算出金额。pipeline.py：把这次金额写入数据库再读出。fusion/price.py：克数乘单价，四舍五入到分。protocol/messages.py：检查报文。domain/models.py：程序内部的重量和状态。device/dynamics.py：稳定判定。device/simulator.py：假秤规则。storage/sqlite.py：本地数据库，现在也能记下名称、单价和金额。vision/interface.py：认物品的空位。catalog/lookup.py：查单价的空位。agent、ui 还是空位。</w:t>
+      </w:r>
+    </w:p>
+    <w:p>
+      <w:r>
+        <w:t xml:space="preserve">.env.example：默认识别和查价都是 mock，这样一启动就能看到香蕉金额。MiniMax、火山引擎和文本模型的 key 都留空。真 key 以后只放在本机 .env，不进仓库。</w:t>
       </w:r>
     </w:p>
     <w:p>
@@ -270,7 +288,7 @@
     </w:p>
     <w:p>
       <w:r>
-        <w:t xml:space="preserve">还没做：启动时直接打印这次结果、真的调用云模型、真机联调。</w:t>
+        <w:t xml:space="preserve">还没做：真的调用云模型、真机联调。</w:t>
       </w:r>
     </w:p>
     <w:sectPr>

</xml_diff>

<commit_message>
Speak the V1 scale protocol over a line port before any board is attached.
A stand-in port yields 326.4 g and accepts tare and display lines. A missing serial port name stops the host, and no COM port is opened.

Co-authored-by: Cursor <cursoragent@cursor.com>
</commit_message>
<xml_diff>
--- a/docs/hardware-handoff.docx
+++ b/docs/hardware-handoff.docx
@@ -253,6 +253,24 @@
         <w:pStyle w:val="Heading2"/>
       </w:pPr>
       <w:r>
+        <w:t xml:space="preserve">3.1 串口协议接到假端口</w:t>
+      </w:r>
+    </w:p>
+    <w:p>
+      <w:r>
+        <w:t xml:space="preserve">电脑现在能读协议里的一行重量 JSON，也能按协议写回去皮和要显示的金额。测试用的是内存里的假端口，不会打开 COM 口，所以没有板子也能验收。坏行会被丢掉，后面的合法重量还在。</w:t>
+      </w:r>
+    </w:p>
+    <w:p>
+      <w:r>
+        <w:t xml:space="preserve">SCALE_DEVICE=serial 但没写 SERIAL_PORT 时，主机直接退出。写了 COM 口也先不打开它，等板子到了再接。固件仍按 docs/protocol.md 发那一行 JSON。</w:t>
+      </w:r>
+    </w:p>
+    <w:p>
+      <w:pPr>
+        <w:pStyle w:val="Heading2"/>
+      </w:pPr>
+      <w:r>
         <w:t xml:space="preserve">目前有哪些文件</w:t>
       </w:r>
     </w:p>
@@ -268,7 +286,7 @@
     </w:p>
     <w:p>
       <w:r>
-        <w:t xml:space="preserve">host/scale_host/main.py：启动入口。默认识别打开时，会打印金额和数据库编号。quote.py：先认物品再查单价。sale.py：等重量稳定后算出金额。pipeline.py：把这次金额写入数据库再读出。fusion/price.py：克数乘单价，四舍五入到分。protocol/messages.py：检查报文。domain/models.py：程序内部的重量和状态。device/dynamics.py：稳定判定。device/simulator.py：假秤规则。storage/sqlite.py：本地数据库，现在也能记下名称、单价和金额。vision/interface.py：认物品的空位。catalog/lookup.py：查单价的空位。agent、ui 还是空位。</w:t>
+        <w:t xml:space="preserve">host/scale_host/main.py：启动入口。模拟器会打印金额；串口只检查有没有端口号，这一步不打开 COM。device/serial_device.py：按协议读写一行 JSON，测试用假端口。quote.py：先认物品再查单价。sale.py：等重量稳定后算出金额。pipeline.py：把这次金额写入数据库再读出。fusion/price.py：克数乘单价，四舍五入到分。protocol/messages.py：检查报文。domain/models.py：程序内部的重量和状态。device/dynamics.py：稳定判定。device/simulator.py：假秤规则。storage/sqlite.py：本地数据库，现在也能记下名称、单价和金额。vision/interface.py：认物品的空位。catalog/lookup.py：查单价的空位。agent、ui 还是空位。</w:t>
       </w:r>
     </w:p>
     <w:p>
@@ -288,7 +306,7 @@
     </w:p>
     <w:p>
       <w:r>
-        <w:t xml:space="preserve">还没做：真的调用云模型、真机联调。</w:t>
+        <w:t xml:space="preserve">还没做：打开真实 COM 口、真的调用云模型、真机联调。</w:t>
       </w:r>
     </w:p>
     <w:sectPr>

</xml_diff>

<commit_message>
Open the configured serial port at 115200 8N1 and release it.
A missing or invalid name stops the host. This machine has no COM port, so the check is the failure path plus the baud settings.

Co-authored-by: Cursor <cursoragent@cursor.com>
</commit_message>
<xml_diff>
--- a/docs/hardware-handoff.docx
+++ b/docs/hardware-handoff.docx
@@ -271,6 +271,24 @@
         <w:pStyle w:val="Heading2"/>
       </w:pPr>
       <w:r>
+        <w:t xml:space="preserve">3.2 按配置打开串口</w:t>
+      </w:r>
+    </w:p>
+    <w:p>
+      <w:r>
+        <w:t xml:space="preserve">主机现在会按 115200、8 数据位、无校验、1 停止位打开 SERIAL_PORT，确认能打开后立刻关掉，避免一直占着端口。打不开就退出，并写明是哪一个端口。这台电脑目前没有 COM 口，所以还看不到板子上的重量。</w:t>
+      </w:r>
+    </w:p>
+    <w:p>
+      <w:r>
+        <w:t xml:space="preserve">没有板子时的验收：把端口名设成一个不存在的名字，例如 COM_NOT_A_PORT，主机应打印 cannot open serial port。固件同学仍不用改接线。</w:t>
+      </w:r>
+    </w:p>
+    <w:p>
+      <w:pPr>
+        <w:pStyle w:val="Heading2"/>
+      </w:pPr>
+      <w:r>
         <w:t xml:space="preserve">目前有哪些文件</w:t>
       </w:r>
     </w:p>
@@ -286,7 +304,7 @@
     </w:p>
     <w:p>
       <w:r>
-        <w:t xml:space="preserve">host/scale_host/main.py：启动入口。模拟器会打印金额；串口只检查有没有端口号，这一步不打开 COM。device/serial_device.py：按协议读写一行 JSON，测试用假端口。quote.py：先认物品再查单价。sale.py：等重量稳定后算出金额。pipeline.py：把这次金额写入数据库再读出。fusion/price.py：克数乘单价，四舍五入到分。protocol/messages.py：检查报文。domain/models.py：程序内部的重量和状态。device/dynamics.py：稳定判定。device/simulator.py：假秤规则。storage/sqlite.py：本地数据库，现在也能记下名称、单价和金额。vision/interface.py：认物品的空位。catalog/lookup.py：查单价的空位。agent、ui 还是空位。</w:t>
+        <w:t xml:space="preserve">host/scale_host/main.py：启动入口。模拟器会打印金额；串口会按 115200 8N1 打开，打不开就退出。device/serial_device.py：按协议读写一行 JSON，并负责打开 COM。quote.py：先认物品再查单价。sale.py：等重量稳定后算出金额。pipeline.py：把这次金额写入数据库再读出。fusion/price.py：克数乘单价，四舍五入到分。protocol/messages.py：检查报文。domain/models.py：程序内部的重量和状态。device/dynamics.py：稳定判定。device/simulator.py：假秤规则。storage/sqlite.py：本地数据库，现在也能记下名称、单价和金额。vision/interface.py：认物品的空位。catalog/lookup.py：查单价的空位。agent、ui 还是空位。</w:t>
       </w:r>
     </w:p>
     <w:p>
@@ -306,7 +324,7 @@
     </w:p>
     <w:p>
       <w:r>
-        <w:t xml:space="preserve">还没做：打开真实 COM 口、真的调用云模型、真机联调。</w:t>
+        <w:t xml:space="preserve">还没做：从真板连续读重量、真的调用云模型。</w:t>
       </w:r>
     </w:p>
     <w:sectPr>

</xml_diff>

<commit_message>
Price a stable serial weight and send the amount back for display.
A replayed 326.4 g line becomes 3.92 yuan without opening a COM port. The same path runs after a real port opens.

Co-authored-by: Cursor <cursoragent@cursor.com>
</commit_message>
<xml_diff>
--- a/docs/hardware-handoff.docx
+++ b/docs/hardware-handoff.docx
@@ -289,6 +289,24 @@
         <w:pStyle w:val="Heading2"/>
       </w:pPr>
       <w:r>
+        <w:t xml:space="preserve">3.3 读到稳定重量再计价</w:t>
+      </w:r>
+    </w:p>
+    <w:p>
+      <w:r>
+        <w:t xml:space="preserve">串口上如果先来一行 WEIGHT_STABLE，再来一行 326.4 克且已经稳定，电脑会算出 3.92 元，写入数据库，并把要显示的金额按协议写回去。没有板子时用一段写好的报文重放，不打开 COM 口。</w:t>
+      </w:r>
+    </w:p>
+    <w:p>
+      <w:r>
+        <w:t xml:space="preserve">命令是 scripts/run_serial_replay.ps1。屏幕上应出现 amount_yuan: 3.92 和 stored: banana-replay。真板插上之后，主机打开端口就会等这样一行；大约一秒没有数据就退出。</w:t>
+      </w:r>
+    </w:p>
+    <w:p>
+      <w:pPr>
+        <w:pStyle w:val="Heading2"/>
+      </w:pPr>
+      <w:r>
         <w:t xml:space="preserve">目前有哪些文件</w:t>
       </w:r>
     </w:p>
@@ -324,7 +342,7 @@
     </w:p>
     <w:p>
       <w:r>
-        <w:t xml:space="preserve">还没做：从真板连续读重量、真的调用云模型。</w:t>
+        <w:t xml:space="preserve">还没做：插上真板连续收重量、真的调用云模型。</w:t>
       </w:r>
     </w:p>
     <w:sectPr>

</xml_diff>

<commit_message>
Price only the stable sample after a rising serial weight sequence.
Unstable lines from 0 g through 326 g are skipped. The 326.4 g stable line is the one that becomes 3.92 yuan.

Co-authored-by: Cursor <cursoragent@cursor.com>
</commit_message>
<xml_diff>
--- a/docs/hardware-handoff.docx
+++ b/docs/hardware-handoff.docx
@@ -307,6 +307,24 @@
         <w:pStyle w:val="Heading2"/>
       </w:pPr>
       <w:r>
+        <w:t xml:space="preserve">3.4 连续重量，稳定后才计价</w:t>
+      </w:r>
+    </w:p>
+    <w:p>
+      <w:r>
+        <w:t xml:space="preserve">假报文按上秤的过程连发 0 克、12 克、145 克、310 克、326 克，这些都还不稳定，不计价。最后一行 326.4 克并且状态是 WEIGHT_STABLE，才算出 3.92 元。屏幕上 skipped: 5 表示前面五行被跳过。不打开 COM 口。</w:t>
+      </w:r>
+    </w:p>
+    <w:p>
+      <w:r>
+        <w:t xml:space="preserve">命令是 scripts/run_serial_sequence.ps1。应看到 skipped: 5 和 amount_yuan: 3.92，以及 stored: banana-sequence。</w:t>
+      </w:r>
+    </w:p>
+    <w:p>
+      <w:pPr>
+        <w:pStyle w:val="Heading2"/>
+      </w:pPr>
+      <w:r>
         <w:t xml:space="preserve">目前有哪些文件</w:t>
       </w:r>
     </w:p>
@@ -342,7 +360,7 @@
     </w:p>
     <w:p>
       <w:r>
-        <w:t xml:space="preserve">还没做：插上真板连续收重量、真的调用云模型。</w:t>
+        <w:t xml:space="preserve">还没做：插上真板收这串重量、真的调用云模型。</w:t>
       </w:r>
     </w:p>
     <w:sectPr>

</xml_diff>

<commit_message>
Store a human correction beside the weighing it fixes.
A banana prediction can be changed to apple, and the saved row still shows the 326.4 g and image path from that weighing.

Co-authored-by: Cursor <cursoragent@cursor.com>
</commit_message>
<xml_diff>
--- a/docs/hardware-handoff.docx
+++ b/docs/hardware-handoff.docx
@@ -325,6 +325,24 @@
         <w:pStyle w:val="Heading2"/>
       </w:pPr>
       <w:r>
+        <w:t xml:space="preserve">4.1 认错了可以改</w:t>
+      </w:r>
+    </w:p>
+    <w:p>
+      <w:r>
+        <w:t xml:space="preserve">一次称重被认成香蕉之后，可以把正确名字改成苹果。数据库记下原来的预测、改后的名字，以及当时的 326.4 克和图片路径。这不是商品总价表，只是这一次称重的更正。不需要板子，也不上网查价格。</w:t>
+      </w:r>
+    </w:p>
+    <w:p>
+      <w:r>
+        <w:t xml:space="preserve">命令是 scripts/run_correct.ps1。应看到 predicted: banana、correct: apple 和 weight_g: 326.4。</w:t>
+      </w:r>
+    </w:p>
+    <w:p>
+      <w:pPr>
+        <w:pStyle w:val="Heading2"/>
+      </w:pPr>
+      <w:r>
         <w:t xml:space="preserve">目前有哪些文件</w:t>
       </w:r>
     </w:p>
@@ -360,7 +378,7 @@
     </w:p>
     <w:p>
       <w:r>
-        <w:t xml:space="preserve">还没做：插上真板收这串重量、真的调用云模型。</w:t>
+        <w:t xml:space="preserve">还没做：插上真板收重量、真的调用云模型。纠错已经可以记下来，但还不会拿它重新训练模型。</w:t>
       </w:r>
     </w:p>
     <w:sectPr>

</xml_diff>

<commit_message>
Describe the vision and text requests without sending them.
The vision draft only identifies an image, and the text draft only looks up a name. A configured API key is not printed or transmitted.

Co-authored-by: Cursor <cursoragent@cursor.com>
</commit_message>
<xml_diff>
--- a/docs/hardware-handoff.docx
+++ b/docs/hardware-handoff.docx
@@ -343,6 +343,24 @@
         <w:pStyle w:val="Heading2"/>
       </w:pPr>
       <w:r>
+        <w:t xml:space="preserve">5.1 两个模型的请求先写好，先不发送</w:t>
+      </w:r>
+    </w:p>
+    <w:p>
+      <w:r>
+        <w:t xml:space="preserve">多模态请求只问这是什么，并带上图片路径。文本请求只根据名字查单价，不看图片。这一步把两份请求打印出来，sent: no 表示没有上网。就算本机已经写了 key，也不会发请求，输出里也不会出现 key。</w:t>
+      </w:r>
+    </w:p>
+    <w:p>
+      <w:r>
+        <w:t xml:space="preserve">命令是 scripts/run_request_preview.ps1。应看到 vision_task: identify、text_task: price_lookup 和 sent: no。真的调用要等 key 补上之后。</w:t>
+      </w:r>
+    </w:p>
+    <w:p>
+      <w:pPr>
+        <w:pStyle w:val="Heading2"/>
+      </w:pPr>
+      <w:r>
         <w:t xml:space="preserve">目前有哪些文件</w:t>
       </w:r>
     </w:p>
@@ -378,7 +396,7 @@
     </w:p>
     <w:p>
       <w:r>
-        <w:t xml:space="preserve">还没做：插上真板收重量、真的调用云模型。纠错已经可以记下来，但还不会拿它重新训练模型。</w:t>
+        <w:t xml:space="preserve">还没做：插上真板收重量、真正把请求发给云模型。</w:t>
       </w:r>
     </w:p>
     <w:sectPr>

</xml_diff>

<commit_message>
Deliver the two drafts to an in-process loopback.
The posts stay inside the program. No socket is opened, and an API key is not copied into the request body.

Co-authored-by: Cursor <cursoragent@cursor.com>
</commit_message>
<xml_diff>
--- a/docs/hardware-handoff.docx
+++ b/docs/hardware-handoff.docx
@@ -361,6 +361,24 @@
         <w:pStyle w:val="Heading2"/>
       </w:pPr>
       <w:r>
+        <w:t xml:space="preserve">5.2 请求先交给本机回环</w:t>
+      </w:r>
+    </w:p>
+    <w:p>
+      <w:r>
+        <w:t xml:space="preserve">两份请求现在会交到程序自己的回环里，确认一份是认物品，一份是按名字查单价。remote: loopback 和 sent_to_internet: no 表示没有访问 MiniMax、火山引擎或其他网站。key 不会写进请求正文。</w:t>
+      </w:r>
+    </w:p>
+    <w:p>
+      <w:r>
+        <w:t xml:space="preserve">命令是 scripts/run_loopback.ps1。应看到 posted: 2 和 sent_to_internet: no。这一步不需要梯子。</w:t>
+      </w:r>
+    </w:p>
+    <w:p>
+      <w:pPr>
+        <w:pStyle w:val="Heading2"/>
+      </w:pPr>
+      <w:r>
         <w:t xml:space="preserve">目前有哪些文件</w:t>
       </w:r>
     </w:p>
@@ -396,7 +414,7 @@
     </w:p>
     <w:p>
       <w:r>
-        <w:t xml:space="preserve">还没做：插上真板收重量、真正把请求发给云模型。</w:t>
+        <w:t xml:space="preserve">还没做：插上真板收重量、把请求真正发给云模型。</w:t>
       </w:r>
     </w:p>
     <w:sectPr>

</xml_diff>

<commit_message>
Ignore a price that arrives inside the vision reply.
The unit price is taken only from the text reply. The sample stays inside the process and is not a market quote.

Co-authored-by: Cursor <cursoragent@cursor.com>
</commit_message>
<xml_diff>
--- a/docs/hardware-handoff.docx
+++ b/docs/hardware-handoff.docx
@@ -372,6 +372,24 @@
     <w:p>
       <w:r>
         <w:t xml:space="preserve">命令是 scripts/run_loopback.ps1。应看到 posted: 2 和 sent_to_internet: no。这一步不需要梯子。</w:t>
+      </w:r>
+    </w:p>
+    <w:p>
+      <w:pPr>
+        <w:pStyle w:val="Heading2"/>
+      </w:pPr>
+      <w:r>
+        <w:t xml:space="preserve">5.3 视觉应答里的价格丢掉</w:t>
+      </w:r>
+    </w:p>
+    <w:p>
+      <w:r>
+        <w:t xml:space="preserve">回环可以假装视觉模型回了一句香蕉，并多写了一个 999 元。解析时这个价格会被丢掉，识别结果里只有名字和置信度。单价只从文本应答里取，这里的 12 元是回环测试数据，不是上网查到的市场价格。</w:t>
+      </w:r>
+    </w:p>
+    <w:p>
+      <w:r>
+        <w:t xml:space="preserve">命令是 scripts/run_parse_response.ps1。应看到 price_from_vision: no、text_price_per_kg: 12.0 和 source: loopback。</w:t>
       </w:r>
     </w:p>
     <w:p>

</xml_diff>

<commit_message>
Price a stable weight from the text reply only.
A price written into the vision reply is not used. The amount stays a loopback fixture and is not fetched from the network.

Co-authored-by: Cursor <cursoragent@cursor.com>
</commit_message>
<xml_diff>
--- a/docs/hardware-handoff.docx
+++ b/docs/hardware-handoff.docx
@@ -390,6 +390,24 @@
     <w:p>
       <w:r>
         <w:t xml:space="preserve">命令是 scripts/run_parse_response.ps1。应看到 price_from_vision: no、text_price_per_kg: 12.0 和 source: loopback。</w:t>
+      </w:r>
+    </w:p>
+    <w:p>
+      <w:pPr>
+        <w:pStyle w:val="Heading2"/>
+      </w:pPr>
+      <w:r>
+        <w:t xml:space="preserve">5.4 用文本应答里的单价算金额</w:t>
+      </w:r>
+    </w:p>
+    <w:p>
+      <w:r>
+        <w:t xml:space="preserve">稳定重量仍是 326.4 克。单价只取文本应答里的每千克 12 元，所以金额是 3.92 元。视觉应答里即使写了 999 元，也不参与计算。这仍是回环测试数据，不是上网查到的价格。单片机还是只报克数。</w:t>
+      </w:r>
+    </w:p>
+    <w:p>
+      <w:r>
+        <w:t xml:space="preserve">命令是 scripts/run_reply_sale.ps1。应看到 price_from_vision: no、amount_yuan: 3.92 和 source: loopback。这一步不需要梯子。</w:t>
       </w:r>
     </w:p>
     <w:p>

</xml_diff>

<commit_message>
Give the scale one display line for the priced banana.
The line carries the text-reply amount. A price written into the vision reply is left out, and no serial port is opened.

Co-authored-by: Cursor <cursoragent@cursor.com>
</commit_message>
<xml_diff>
--- a/docs/hardware-handoff.docx
+++ b/docs/hardware-handoff.docx
@@ -408,6 +408,47 @@
     <w:p>
       <w:r>
         <w:t xml:space="preserve">命令是 scripts/run_reply_sale.ps1。应看到 price_from_vision: no、amount_yuan: 3.92 和 source: loopback。这一步不需要梯子。</w:t>
+      </w:r>
+    </w:p>
+    <w:p>
+      <w:pPr>
+        <w:pStyle w:val="Heading2"/>
+      </w:pPr>
+      <w:r>
+        <w:t xml:space="preserve">5.5 电脑回给你的显示行</w:t>
+      </w:r>
+    </w:p>
+    <w:p>
+      <w:r>
+        <w:t xml:space="preserve">金额算完之后，电脑会按协议回一行 display_result。示例是香蕉、326.4 克、3.92 元。视觉模型如果多写了 999 元，这一行里不会出现。你在单片机上解析这一行即可，不用认识商品，也不用算价格。这一步不打开 COM 口。</w:t>
+      </w:r>
+    </w:p>
+    <w:p>
+      <w:r>
+        <w:t xml:space="preserve">命令是 scripts/run_display_line.ps1。应看到一行 JSON，里面有 product banana、weight_g 326.4 和 price 3.92。</w:t>
+      </w:r>
+    </w:p>
+    <w:p>
+      <w:pPr>
+        <w:pStyle w:val="Heading2"/>
+      </w:pPr>
+      <w:r>
+        <w:t xml:space="preserve">你可以现在开始固件</w:t>
+      </w:r>
+    </w:p>
+    <w:p>
+      <w:r>
+        <w:t xml:space="preserve">协议、状态机、电脑读重量、电脑回显示，软件这边已经齐了。你不用等摄像头，也不用等云模型的 key。</w:t>
+      </w:r>
+    </w:p>
+    <w:p>
+      <w:r>
+        <w:t xml:space="preserve">请先回复三件事：芯片是 F103 还是 F107、称重传感器满量程、HX711 的 DT 和 SCK 接在哪两个脚。过载阈值等量程确认后再填。上电不要自动去皮。</w:t>
+      </w:r>
+    </w:p>
+    <w:p>
+      <w:r>
+        <w:t xml:space="preserve">固件要做的是：读 HX711，按八个状态切换，用一行 JSON 上报 weight 和 status，收到 tare 后去皮并回 ack，收到 display_result 后显示商品名、克数和金额。屏幕可以后做。课程里的点灯工程不要拷进这个仓库。</w:t>
       </w:r>
     </w:p>
     <w:p>

</xml_diff>

<commit_message>
Store the reply-priced amount beside the display line.
The saved yuan and the price sent for display are the same number. A price written into the vision reply is not stored.

Co-authored-by: Cursor <cursoragent@cursor.com>
</commit_message>
<xml_diff>
--- a/docs/hardware-handoff.docx
+++ b/docs/hardware-handoff.docx
@@ -426,6 +426,24 @@
     <w:p>
       <w:r>
         <w:t xml:space="preserve">命令是 scripts/run_display_line.ps1。应看到一行 JSON，里面有 product banana、weight_g 326.4 和 price 3.92。</w:t>
+      </w:r>
+    </w:p>
+    <w:p>
+      <w:pPr>
+        <w:pStyle w:val="Heading2"/>
+      </w:pPr>
+      <w:r>
+        <w:t xml:space="preserve">5.6 记下的金额和显示行相同</w:t>
+      </w:r>
+    </w:p>
+    <w:p>
+      <w:r>
+        <w:t xml:space="preserve">这一笔 3.92 元会写入电脑本地的一次称重记录，再读出来。读回的金额和要发给单片机的显示金额是同一个数。视觉应答里的 999 元不会进数据库。这不是商品总价表，只记这一次。不打开 COM 口，也不上网。</w:t>
+      </w:r>
+    </w:p>
+    <w:p>
+      <w:r>
+        <w:t xml:space="preserve">命令是 scripts/run_reply_record.ps1。应看到 stored: banana-reply、amount_yuan: 3.92、display_price: 3.92 和 same_amount: yes。</w:t>
       </w:r>
     </w:p>
     <w:p>

</xml_diff>

<commit_message>
Price a scripted serial weight from the text reply.
The stable line becomes the display price and the stored amount. No COM port is opened, and a vision-reply price is not used.

Co-authored-by: Cursor <cursoragent@cursor.com>
</commit_message>
<xml_diff>
--- a/docs/hardware-handoff.docx
+++ b/docs/hardware-handoff.docx
@@ -444,6 +444,24 @@
     <w:p>
       <w:r>
         <w:t xml:space="preserve">命令是 scripts/run_reply_record.ps1。应看到 stored: banana-reply、amount_yuan: 3.92、display_price: 3.92 和 same_amount: yes。</w:t>
+      </w:r>
+    </w:p>
+    <w:p>
+      <w:pPr>
+        <w:pStyle w:val="Heading2"/>
+      </w:pPr>
+      <w:r>
+        <w:t xml:space="preserve">5.7 假串口的稳定重量也走应答计价</w:t>
+      </w:r>
+    </w:p>
+    <w:p>
+      <w:r>
+        <w:t xml:space="preserve">现在把协议里的一行稳定重量放进假端口：先是 WEIGHT_STABLE，再是 326.4 克。电脑用文本应答里的每千克 12 元算出 3.92 元，写回显示行，并记进这一次称重。视觉应答里的 999 元不会出现在显示行里。不打开真实 COM 口，也不上网。单片机以后只要按协议发出这两行即可。</w:t>
+      </w:r>
+    </w:p>
+    <w:p>
+      <w:r>
+        <w:t xml:space="preserve">命令是 scripts/run_serial_reply.ps1。应看到 weight_g: 326.4、display_price: 3.92、stored: banana-serial-reply、same_amount: yes 和 sent_to_internet: no。</w:t>
       </w:r>
     </w:p>
     <w:p>

</xml_diff>

<commit_message>
Price only the stable line in a rising serial sequence.
Earlier weights are skipped. The display price still comes from the text reply, and no COM port is opened.

Co-authored-by: Cursor <cursoragent@cursor.com>
</commit_message>
<xml_diff>
--- a/docs/hardware-handoff.docx
+++ b/docs/hardware-handoff.docx
@@ -462,6 +462,24 @@
     <w:p>
       <w:r>
         <w:t xml:space="preserve">命令是 scripts/run_serial_reply.ps1。应看到 weight_g: 326.4、display_price: 3.92、stored: banana-serial-reply、same_amount: yes 和 sent_to_internet: no。</w:t>
+      </w:r>
+    </w:p>
+    <w:p>
+      <w:pPr>
+        <w:pStyle w:val="Heading2"/>
+      </w:pPr>
+      <w:r>
+        <w:t xml:space="preserve">5.8 还在变化的重量不计价</w:t>
+      </w:r>
+    </w:p>
+    <w:p>
+      <w:r>
+        <w:t xml:space="preserve">假串口按上秤的过程连发 0 克、12 克、145 克、310 克、326 克，这些都还不稳定，不计价，也不写显示行。最后一行 326.4 克并且状态是 WEIGHT_STABLE，才用文本应答里的单价算出 3.92 元。屏幕上 skipped: 5 表示前面五行被跳过。视觉应答里的 999 元仍然不参与。不打开真实 COM 口，也不上网。</w:t>
+      </w:r>
+    </w:p>
+    <w:p>
+      <w:r>
+        <w:t xml:space="preserve">命令是 scripts/run_serial_reply_sequence.ps1。应看到 skipped: 5、display_price: 3.92 和 stored: banana-serial-sequence。</w:t>
       </w:r>
     </w:p>
     <w:p>

</xml_diff>

<commit_message>
Do not price a scale that reports overload.
The host writes no display line. The overload threshold stays on the microcontroller, and no COM port is opened.

Co-authored-by: Cursor <cursoragent@cursor.com>
</commit_message>
<xml_diff>
--- a/docs/hardware-handoff.docx
+++ b/docs/hardware-handoff.docx
@@ -480,6 +480,24 @@
     <w:p>
       <w:r>
         <w:t xml:space="preserve">命令是 scripts/run_serial_reply_sequence.ps1。应看到 skipped: 5、display_price: 3.92 和 stored: banana-serial-sequence。</w:t>
+      </w:r>
+    </w:p>
+    <w:p>
+      <w:pPr>
+        <w:pStyle w:val="Heading2"/>
+      </w:pPr>
+      <w:r>
+        <w:t xml:space="preserve">5.9 过载时电脑不回价格</w:t>
+      </w:r>
+    </w:p>
+    <w:p>
+      <w:r>
+        <w:t xml:space="preserve">你在状态里报 OVERLOAD 时，电脑不计算金额，也不回 display_result。过载阈值仍等传感器量程确认后由你在单片机里判断，电脑不另定一条克数线。这一步用假端口重放，不打开真实 COM 口，也不上网。</w:t>
+      </w:r>
+    </w:p>
+    <w:p>
+      <w:r>
+        <w:t xml:space="preserve">命令是 scripts/run_overload_guard.ps1。应看到 priced: no、reason: overload 和 display_sent: no。</w:t>
       </w:r>
     </w:p>
     <w:p>

</xml_diff>

<commit_message>
Do not price a scale after the item is removed.
A stable remainder still inside the empty band is not a sale, and no display line is written.

Co-authored-by: Cursor <cursoragent@cursor.com>
</commit_message>
<xml_diff>
--- a/docs/hardware-handoff.docx
+++ b/docs/hardware-handoff.docx
@@ -498,6 +498,24 @@
     <w:p>
       <w:r>
         <w:t xml:space="preserve">命令是 scripts/run_overload_guard.ps1。应看到 priced: no、reason: overload 和 display_sent: no。</w:t>
+      </w:r>
+    </w:p>
+    <w:p>
+      <w:pPr>
+        <w:pStyle w:val="Heading2"/>
+      </w:pPr>
+      <w:r>
+        <w:t xml:space="preserve">5.10 东西拿走后不回价格</w:t>
+      </w:r>
+    </w:p>
+    <w:p>
+      <w:r>
+        <w:t xml:space="preserve">你报 WEIGHT_REMOVED 时，电脑不计算金额，也不回 display_result。示例里净重是 0.4 克，而且这一行写了已经稳定，电脑仍然不把它当成要计价的商品。这条状态只发一次，下一行应是 ZERO。不打开真实 COM 口，也不上网。</w:t>
+      </w:r>
+    </w:p>
+    <w:p>
+      <w:r>
+        <w:t xml:space="preserve">命令是 scripts/run_removed_guard.ps1。应看到 priced: no、reason: removed 和 display_sent: no。</w:t>
       </w:r>
     </w:p>
     <w:p>

</xml_diff>

<commit_message>
Read the zeroed weight after a successful tare.
The scripted scale answers ok and then reports ZERO. No COM port is opened.

Co-authored-by: Cursor <cursoragent@cursor.com>
</commit_message>
<xml_diff>
--- a/docs/hardware-handoff.docx
+++ b/docs/hardware-handoff.docx
@@ -516,6 +516,24 @@
     <w:p>
       <w:r>
         <w:t xml:space="preserve">命令是 scripts/run_removed_guard.ps1。应看到 priced: no、reason: removed 和 display_sent: no。</w:t>
+      </w:r>
+    </w:p>
+    <w:p>
+      <w:pPr>
+        <w:pStyle w:val="Heading2"/>
+      </w:pPr>
+      <w:r>
+        <w:t xml:space="preserve">5.11 去皮之后回到零</w:t>
+      </w:r>
+    </w:p>
+    <w:p>
+      <w:r>
+        <w:t xml:space="preserve">电脑会发给你一行 command，内容只有 tare。你去皮成功后回 ack，status 是 ok，然后进入 ZERO。下一行 weight 的净重应是 0，tare_g 是这次减掉的克数。示例里这个偏移是 12.7 克。上电不要自动做这件事。这一步不打开真实 COM 口，也不上网。</w:t>
+      </w:r>
+    </w:p>
+    <w:p>
+      <w:r>
+        <w:t xml:space="preserve">命令是 scripts/run_tare_roundtrip.ps1。应看到 command: tare、ack: ok、next_state: ZERO、weight_g: 0.0 和 tare_g: 12.7。</w:t>
       </w:r>
     </w:p>
     <w:p>

</xml_diff>

<commit_message>
Keep the tare offset when the scale is overloaded.
The ack is an error, the state stays OVERLOAD, and no COM port is opened.

Co-authored-by: Cursor <cursoragent@cursor.com>
</commit_message>
<xml_diff>
--- a/docs/hardware-handoff.docx
+++ b/docs/hardware-handoff.docx
@@ -534,6 +534,24 @@
     <w:p>
       <w:r>
         <w:t xml:space="preserve">命令是 scripts/run_tare_roundtrip.ps1。应看到 command: tare、ack: ok、next_state: ZERO、weight_g: 0.0 和 tare_g: 12.7。</w:t>
+      </w:r>
+    </w:p>
+    <w:p>
+      <w:pPr>
+        <w:pStyle w:val="Heading2"/>
+      </w:pPr>
+      <w:r>
+        <w:t xml:space="preserve">5.12 过载时不要去皮</w:t>
+      </w:r>
+    </w:p>
+    <w:p>
+      <w:r>
+        <w:t xml:space="preserve">秤处于 OVERLOAD、ERROR 或刚上电的 BOOT 时，如果收到 tare，不要改偏移，回复 ack 的 status 为 error，状态保持不变。示例是过载：应答失败，tare_g 仍是 12.7 克，没有回到 ZERO。不打开真实 COM 口，也不上网。</w:t>
+      </w:r>
+    </w:p>
+    <w:p>
+      <w:r>
+        <w:t xml:space="preserve">命令是 scripts/run_tare_rejected.ps1。应看到 command: tare、ack: error、state: OVERLOAD 和 tare_g: 12.7。</w:t>
       </w:r>
     </w:p>
     <w:p>

</xml_diff>

<commit_message>
Send one display line for a placement, then stay silent after removal.
An unstable weight is not priced. The vision-reply price is not shown, and no COM port is opened.

Co-authored-by: Cursor <cursoragent@cursor.com>
</commit_message>
<xml_diff>
--- a/docs/hardware-handoff.docx
+++ b/docs/hardware-handoff.docx
@@ -552,6 +552,24 @@
     <w:p>
       <w:r>
         <w:t xml:space="preserve">命令是 scripts/run_tare_rejected.ps1。应看到 command: tare、ack: error、state: OVERLOAD 和 tare_g: 12.7。</w:t>
+      </w:r>
+    </w:p>
+    <w:p>
+      <w:pPr>
+        <w:pStyle w:val="Heading2"/>
+      </w:pPr>
+      <w:r>
+        <w:t xml:space="preserve">5.13 放上再拿走，只回一行价格</w:t>
+      </w:r>
+    </w:p>
+    <w:p>
+      <w:r>
+        <w:t xml:space="preserve">一次完整过程至少有 WEIGHT_CHANGED、WEIGHT_STABLE、WEIGHT_REMOVED。145 克还在变化时，电脑不回价格。326.4 克稳定后回一行 3.92 元。随后你报东西被拿走，电脑不再回第二行。视觉应答里的 999 元不会出现。不打开真实 COM 口，也不上网。</w:t>
+      </w:r>
+    </w:p>
+    <w:p>
+      <w:r>
+        <w:t xml:space="preserve">命令是 scripts/run_place_and_remove.ps1。应看到 displays: 1、display_price: 3.92 和 after_remove: no。</w:t>
       </w:r>
     </w:p>
     <w:p>

</xml_diff>

<commit_message>
Refuse a sale when the vision and text labels disagree.
A matching pair still prices from the text reply. No request is sent.

Co-authored-by: Cursor <cursoragent@cursor.com>
</commit_message>
<xml_diff>
--- a/docs/hardware-handoff.docx
+++ b/docs/hardware-handoff.docx
@@ -570,6 +570,24 @@
     <w:p>
       <w:r>
         <w:t xml:space="preserve">命令是 scripts/run_place_and_remove.ps1。应看到 displays: 1、display_price: 3.92 和 after_remove: no。</w:t>
+      </w:r>
+    </w:p>
+    <w:p>
+      <w:pPr>
+        <w:pStyle w:val="Heading2"/>
+      </w:pPr>
+      <w:r>
+        <w:t xml:space="preserve">5.14 两个模型说的不是同一个名字</w:t>
+      </w:r>
+    </w:p>
+    <w:p>
+      <w:r>
+        <w:t xml:space="preserve">认物品的模型和查单价的模型必须说同一个名字。视觉说香蕉、文本说苹果时，电脑不计价，也不回 display_result，文本里的单价也不会被拿来用。两边都说香蕉时，仍然是 326.4 克对应 3.92 元。这一步不联网。单片机不用改协议；只是有时重量已经稳定，电脑也不会回价格。</w:t>
+      </w:r>
+    </w:p>
+    <w:p>
+      <w:r>
+        <w:t xml:space="preserve">命令是 scripts/run_label_guard.ps1。应看到 priced: no、reason: label mismatch、vision_label: banana 和 text_label: apple。</w:t>
       </w:r>
     </w:p>
     <w:p>

</xml_diff>

<commit_message>
Do not display a price when a stable weight has disagreeing labels.
The scripted scale still reports 326.4 g. No COM port is opened.

Co-authored-by: Cursor <cursoragent@cursor.com>
</commit_message>
<xml_diff>
--- a/docs/hardware-handoff.docx
+++ b/docs/hardware-handoff.docx
@@ -588,6 +588,24 @@
     <w:p>
       <w:r>
         <w:t xml:space="preserve">命令是 scripts/run_label_guard.ps1。应看到 priced: no、reason: label mismatch、vision_label: banana 和 text_label: apple。</w:t>
+      </w:r>
+    </w:p>
+    <w:p>
+      <w:pPr>
+        <w:pStyle w:val="Heading2"/>
+      </w:pPr>
+      <w:r>
+        <w:t xml:space="preserve">5.15 重量已经稳定，名字不一致也不回价格</w:t>
+      </w:r>
+    </w:p>
+    <w:p>
+      <w:r>
+        <w:t xml:space="preserve">你按协议报了稳定的 326.4 克之后，电脑仍可能不回 display_result。这一步的原因是认物品的模型说香蕉，查单价的模型说苹果。电脑不会把苹果的单价安到香蕉上，也不会写显示行。不打开真实 COM 口，也不上网。</w:t>
+      </w:r>
+    </w:p>
+    <w:p>
+      <w:r>
+        <w:t xml:space="preserve">命令是 scripts/run_serial_label_guard.ps1。应看到 weight_g: 326.4、priced: no、reason: label mismatch 和 display_sent: no。</w:t>
       </w:r>
     </w:p>
     <w:p>

</xml_diff>

<commit_message>
Price the stable weight that follows a bad serial line.
A bare number is dropped. The following stable line still becomes the display price, and no COM port is opened.

Co-authored-by: Cursor <cursoragent@cursor.com>
</commit_message>
<xml_diff>
--- a/docs/hardware-handoff.docx
+++ b/docs/hardware-handoff.docx
@@ -606,6 +606,24 @@
     <w:p>
       <w:r>
         <w:t xml:space="preserve">命令是 scripts/run_serial_label_guard.ps1。应看到 weight_g: 326.4、priced: no、reason: label mismatch 和 display_sent: no。</w:t>
+      </w:r>
+    </w:p>
+    <w:p>
+      <w:pPr>
+        <w:pStyle w:val="Heading2"/>
+      </w:pPr>
+      <w:r>
+        <w:t xml:space="preserve">5.16 坏行丢掉，后面的稳定重量仍计价</w:t>
+      </w:r>
+    </w:p>
+    <w:p>
+      <w:r>
+        <w:t xml:space="preserve">如果串口上夹了一行不是 JSON 的内容，例如裸数字 123.45，电脑丢掉这一行，不把它当成重量。后面跟着的稳定 326.4 克仍然按文本应答计价，回一行 3.92 元。不打开真实 COM 口，也不上网。</w:t>
+      </w:r>
+    </w:p>
+    <w:p>
+      <w:r>
+        <w:t xml:space="preserve">命令是 scripts/run_bad_line.ps1。应看到 bad_line: dropped、weight_g: 326.4、display_price: 3.92 和 stored: banana-bad-line。</w:t>
       </w:r>
     </w:p>
     <w:p>

</xml_diff>

<commit_message>
Keep pricing when a stable weight line has an unknown field.
The extra field is not copied into the display line, and no COM port is opened.

Co-authored-by: Cursor <cursoragent@cursor.com>
</commit_message>
<xml_diff>
--- a/docs/hardware-handoff.docx
+++ b/docs/hardware-handoff.docx
@@ -624,6 +624,24 @@
     <w:p>
       <w:r>
         <w:t xml:space="preserve">命令是 scripts/run_bad_line.ps1。应看到 bad_line: dropped、weight_g: 326.4、display_price: 3.92 和 stored: banana-bad-line。</w:t>
+      </w:r>
+    </w:p>
+    <w:p>
+      <w:pPr>
+        <w:pStyle w:val="Heading2"/>
+      </w:pPr>
+      <w:r>
+        <w:t xml:space="preserve">5.17 多出来的字段不要整行丢掉</w:t>
+      </w:r>
+    </w:p>
+    <w:p>
+      <w:r>
+        <w:t xml:space="preserve">重量行里如果多了一个协议没规定的字段，例如 note，电脑忽略它，仍然用这一行的 326.4 克计价，回 3.92 元。这个多余字段不会出现在回给你的显示行里。以后你加调试字段，不用先改电脑程序。不打开真实 COM 口，也不上网。</w:t>
+      </w:r>
+    </w:p>
+    <w:p>
+      <w:r>
+        <w:t xml:space="preserve">命令是 scripts/run_extra_field.ps1。应看到 extra_field: ignored、display_price: 3.92 和 note_in_display: no。</w:t>
       </w:r>
     </w:p>
     <w:p>

</xml_diff>

<commit_message>
Do not price a scale that reports a sensor error.
ERROR is separate from overload. No display line is written, and no COM port is opened.

Co-authored-by: Cursor <cursoragent@cursor.com>
</commit_message>
<xml_diff>
--- a/docs/hardware-handoff.docx
+++ b/docs/hardware-handoff.docx
@@ -642,6 +642,24 @@
     <w:p>
       <w:r>
         <w:t xml:space="preserve">命令是 scripts/run_extra_field.ps1。应看到 extra_field: ignored、display_price: 3.92 和 note_in_display: no。</w:t>
+      </w:r>
+    </w:p>
+    <w:p>
+      <w:pPr>
+        <w:pStyle w:val="Heading2"/>
+      </w:pPr>
+      <w:r>
+        <w:t xml:space="preserve">5.18 读不到传感器时不回价格</w:t>
+      </w:r>
+    </w:p>
+    <w:p>
+      <w:r>
+        <w:t xml:space="preserve">连续大约 1 秒读不到 HX711，或数据线一直不就绪，状态报 ERROR，weight 的 status 用 error。这和 OVERLOAD 不是同一件事，过载阈值仍等你确认量程。电脑看到 ERROR 就不计算金额，也不回 display_result。不打开真实 COM 口，也不上网。</w:t>
+      </w:r>
+    </w:p>
+    <w:p>
+      <w:r>
+        <w:t xml:space="preserve">命令是 scripts/run_error_guard.ps1。应看到 priced: no、reason: error 和 display_sent: no。</w:t>
       </w:r>
     </w:p>
     <w:p>

</xml_diff>

<commit_message>
Reject tare while the scale is still booting.
The offset stays zero and the state stays BOOT. No COM port is opened.

Co-authored-by: Cursor <cursoragent@cursor.com>
</commit_message>
<xml_diff>
--- a/docs/hardware-handoff.docx
+++ b/docs/hardware-handoff.docx
@@ -660,6 +660,24 @@
     <w:p>
       <w:r>
         <w:t xml:space="preserve">命令是 scripts/run_error_guard.ps1。应看到 priced: no、reason: error 和 display_sent: no。</w:t>
+      </w:r>
+    </w:p>
+    <w:p>
+      <w:pPr>
+        <w:pStyle w:val="Heading2"/>
+      </w:pPr>
+      <w:r>
+        <w:t xml:space="preserve">5.19 刚上电时不要去皮</w:t>
+      </w:r>
+    </w:p>
+    <w:p>
+      <w:r>
+        <w:t xml:space="preserve">HX711 还不能读、状态是 BOOT 时，如果收到 tare，不要改偏移，回复 ack 的 status 为 error，状态保持 BOOT。这时偏移仍是 0。上电本来就不要自动去皮。不打开真实 COM 口，也不上网。</w:t>
+      </w:r>
+    </w:p>
+    <w:p>
+      <w:r>
+        <w:t xml:space="preserve">命令是 scripts/run_boot_tare.ps1。应看到 command: tare、ack: error、state: BOOT 和 tare_g: 0.0。</w:t>
       </w:r>
     </w:p>
     <w:p>

</xml_diff>

<commit_message>
Price the stable weight that follows a sensor error.
The error line is skipped. The next stable line still becomes the display price, and no COM port is opened.

Co-authored-by: Cursor <cursoragent@cursor.com>
</commit_message>
<xml_diff>
--- a/docs/hardware-handoff.docx
+++ b/docs/hardware-handoff.docx
@@ -678,6 +678,24 @@
     <w:p>
       <w:r>
         <w:t xml:space="preserve">命令是 scripts/run_boot_tare.ps1。应看到 command: tare、ack: error、state: BOOT 和 tare_g: 0.0。</w:t>
+      </w:r>
+    </w:p>
+    <w:p>
+      <w:pPr>
+        <w:pStyle w:val="Heading2"/>
+      </w:pPr>
+      <w:r>
+        <w:t xml:space="preserve">5.20 故障消失后，后面的稳定重量仍计价</w:t>
+      </w:r>
+    </w:p>
+    <w:p>
+      <w:r>
+        <w:t xml:space="preserve">ERROR 消失后你会回到 READY，然后可以再正常称重。电脑不会因为前面有过故障，就拒绝后面的稳定重量。示例里故障那一行被跳过，随后 326.4 克仍回 3.92 元。不打开真实 COM 口，也不上网。</w:t>
+      </w:r>
+    </w:p>
+    <w:p>
+      <w:r>
+        <w:t xml:space="preserve">命令是 scripts/run_error_then_stable.ps1。应看到 skipped: 1、display_price: 3.92 和 stored: banana-after-error。</w:t>
       </w:r>
     </w:p>
     <w:p>

</xml_diff>

<commit_message>
Drop a serial line that exceeds the V1 size limit.
The following stable weight is still priced. No COM port is opened.

Co-authored-by: Cursor <cursoragent@cursor.com>
</commit_message>
<xml_diff>
--- a/docs/hardware-handoff.docx
+++ b/docs/hardware-handoff.docx
@@ -696,6 +696,42 @@
     <w:p>
       <w:r>
         <w:t xml:space="preserve">命令是 scripts/run_error_then_stable.ps1。应看到 skipped: 1、display_price: 3.92 和 stored: banana-after-error。</w:t>
+      </w:r>
+    </w:p>
+    <w:p>
+      <w:pPr>
+        <w:pStyle w:val="Heading2"/>
+      </w:pPr>
+      <w:r>
+        <w:t xml:space="preserve">5.21 一行不要超过 512 字节</w:t>
+      </w:r>
+    </w:p>
+    <w:p>
+      <w:r>
+        <w:t xml:space="preserve">协议规定一行不含换行最多 512 字节。更长的一行电脑会丢掉，不把它当成重量，也不让它挡住后面的数据。后面如果还有稳定的 326.4 克，仍然回 3.92 元。调试时不要把长日志塞进同一行 JSON。不打开真实 COM 口，也不上网。</w:t>
+      </w:r>
+    </w:p>
+    <w:p>
+      <w:r>
+        <w:t xml:space="preserve">命令是 scripts/run_long_line.ps1。应看到 long_line: dropped、weight_g: 326.4 和 display_price: 3.92。</w:t>
+      </w:r>
+    </w:p>
+    <w:p>
+      <w:pPr>
+        <w:pStyle w:val="Heading2"/>
+      </w:pPr>
+      <w:r>
+        <w:t xml:space="preserve">协议侧可以按现在的文档做</w:t>
+      </w:r>
+    </w:p>
+    <w:p>
+      <w:r>
+        <w:t xml:space="preserve">串口上要遵守的规则到这里就齐了：一行一个 JSON、八个状态、稳定后才有价格、过载和故障和拿走和刚上电都不去皮或不出价、坏行和超长行丢掉、多出来的字段可以忽略。细节以 docs/protocol.md 和 docs/state-machine.md 为准。</w:t>
+      </w:r>
+    </w:p>
+    <w:p>
+      <w:r>
+        <w:t xml:space="preserve">电脑在没有云模型 key 时不会上网查价。固件仍等你确认芯片、传感器量程和 HX711 的两个脚。板子插上之后才做真串口联调。</w:t>
       </w:r>
     </w:p>
     <w:p>

</xml_diff>